<commit_message>
update final project report, presentation and add QA summary documentation
</commit_message>
<xml_diff>
--- a/final/Project_Report_Final.docx
+++ b/final/Project_Report_Final.docx
@@ -168,7 +168,7 @@
           <w:sz w:val="21"/>
           <w:szCs w:val="21"/>
         </w:rPr>
-        <w:t xml:space="preserve">Classical process models such as the Streeter–Phelps oxygen-sag equation [8] require site-specific calibration. Breiman [1] introduced Random Forests, which reduce variance by bootstrap aggregation and random feature subspaces. Chen and Guestrin [3] developed XGBoost, a regularised second-order gradient-boosting system. Lundberg and Lee [4] formalised SHAP values and TreeSHAP for tree ensembles. For the planned Phase 2, Goodfellow, Bengio and Courville [2] provide the reference treatment of deep feed-forward networks (multilayer perceptrons, regularisation and optimisation) that will guide a multi-task network on the same inputs. The CCME index itself follows the CCME technical report [5].</w:t>
+        <w:t xml:space="preserve">Classical process models such as the Streeter–Phelps oxygen-sag equation require site-specific calibration and do not scale easily across catchments. Breiman [1] introduced Random Forests, which reduce variance by bootstrap aggregation and random feature subspaces. Chen and Guestrin [2] developed XGBoost, a regularised second-order gradient-boosting system. Both are used here as the Phase 1 models, with SHAP values used for attribution.</w:t>
       </w:r>
     </w:p>
     <w:p>
@@ -1307,7 +1307,7 @@
           <w:sz w:val="21"/>
           <w:szCs w:val="21"/>
         </w:rPr>
-        <w:t xml:space="preserve">“Zero nulls” describes the delivered file. Several raw columns cluster at single values (BOD median 2.70 and upper quartile 2.83 mg/L; nitrate median 4.50 and upper quartile 4.94 mg/L), and the repository’s audit graph 17, produced from an earlier data version, reports 26–34% missing values in the chemical columns. The repository does not show whether the zero-null file reflects genuine measurements or filling performed before the data were assembled. We therefore avoid describing the data as “authentic complete ground truth”.</w:t>
+        <w:t xml:space="preserve">“Zero nulls” describes the delivered file. Several raw columns cluster at single values (BOD median 2.70 and upper quartile 2.83 mg/L; nitrate median 4.50 and upper quartile 4.94 mg/L), and the repository’s audit graph 17 reports 26–34% missing values in the chemical columns, which conflicts with the zero-null notebook output. The repository does not show whether the zero-null file reflects genuine measurements or filling performed before the data were assembled. We therefore avoid describing the data as “authentic complete ground truth”.</w:t>
       </w:r>
     </w:p>
     <w:p>
@@ -2316,7 +2316,7 @@
           <w:sz w:val="21"/>
           <w:szCs w:val="21"/>
         </w:rPr>
-        <w:t xml:space="preserve">The preprocessing notebook builds 30 engineered features on top of the eight base measurements, giving 38 model inputs (recorded in preprocessing_metadata.json). The chemistry follows Benson and Krause [6] for oxygen saturation, Redfield [7] for nutrient stoichiometry and Emerson et al. [9] for un-ionised ammonia.</w:t>
+        <w:t xml:space="preserve">The preprocessing notebook builds 30 engineered features on top of the eight base measurements, giving 38 model inputs (recorded in preprocessing_metadata.json).</w:t>
       </w:r>
     </w:p>
     <w:p>
@@ -4243,7 +4243,7 @@
           <w:sz w:val="21"/>
           <w:szCs w:val="21"/>
         </w:rPr>
-        <w:t xml:space="preserve">The lags are built on the whole dataset before the split. With a random split, the previous record of a station can sit in the training set while the current record is in validation, so evaluation is not independent across time or station. The quarantine tests check named target columns on a synthetic frame and the stored feature list; they cannot show that the measured inputs themselves, from which the index is computed, are free of target information.</w:t>
+        <w:t xml:space="preserve">The lags are built on the whole dataset before the split. With a random split, the preceding record of a station can sit in the training set while the current record is in validation, so evaluation is not independent across time or station. The quarantine tests check named target columns on a synthetic frame and the stored feature list; they cannot show that the measured inputs themselves, from which the index is computed, are free of target information.</w:t>
       </w:r>
     </w:p>
     <w:p>
@@ -4638,7 +4638,7 @@
           <w:sz w:val="21"/>
           <w:szCs w:val="21"/>
         </w:rPr>
-        <w:t xml:space="preserve">Earlier documents (including the previous report draft) listed 100 trees at depth 20 with sqrt(p) features for the forest and 300 rounds at depth 8 and rate 0.05 for XGBoost. Those settings do not match the notebook or the saved models and have been corrected here. XGBoost’s early stopping watches the validation set, so its validation score is slightly optimistic.</w:t>
+        <w:t xml:space="preserve">Some project documents list 100 trees at depth 20 with sqrt(p) features for the forest and 300 rounds at depth 8 and rate 0.05 for XGBoost. Those settings do not match the notebook or the saved models, so the values in Table V are used. XGBoost’s early stopping watches the validation set, so its validation score is slightly optimistic.</w:t>
       </w:r>
     </w:p>
     <w:p>
@@ -5623,7 +5623,7 @@
           <w:sz w:val="21"/>
           <w:szCs w:val="21"/>
         </w:rPr>
-        <w:t xml:space="preserve">The comparison file, computed from the stored predictions file, gives MAE 0.1375 and RMSE 0.3740, which the previous report quoted. The training notebook, and the validation RMSE recorded inside the saved XGBoost model (0.4372), give MAE 0.1611. The stored predictions therefore do not match the saved model, and a graph in the repository (graph 15) likewise reflects a different XGBoost ranking than the saved model. The Random Forest figures agree across all artifacts. The conclusion is unchanged (both versions reconstruct the index with R² above 0.999), but the notebooks 03 and 04 should be re-run so that all artifacts come from one model. For the Random Forest, training MAE is 0.047 against validation 0.052, a small gap that is expected with a random split.</w:t>
+        <w:t xml:space="preserve">The comparison file, computed from the stored predictions file, gives MAE 0.1375 and RMSE 0.3740, which the project documentation quotes. The training notebook, and the validation RMSE recorded inside the saved XGBoost model (0.4372), give MAE 0.1611. The stored predictions therefore do not match the saved model, and a graph in the repository (graph 15) likewise reflects a different XGBoost ranking than the saved model. The Random Forest figures agree across all artifacts. The conclusion is unchanged (both sets of numbers reconstruct the index with R² above 0.999), but the notebooks 03 and 04 should be re-run so that all artifacts come from one model. For the Random Forest, training MAE is 0.047 against validation 0.052, a small gap that is expected with a random split.</w:t>
       </w:r>
     </w:p>
     <w:p>
@@ -5647,7 +5647,7 @@
           <w:sz w:val="21"/>
           <w:szCs w:val="21"/>
         </w:rPr>
-        <w:t xml:space="preserve">Earlier drafts reported inference times (0.42 s for XGBoost, 3.85 s for the forest). No timing code, hardware description or matching model configuration is present in the repository, so these figures are not reported.</w:t>
+        <w:t xml:space="preserve">Some project documents report inference times (0.42 s for XGBoost, 3.85 s for the forest). No timing code, hardware description or matching model configuration is present in the repository, so these figures are not reported.</w:t>
       </w:r>
     </w:p>
     <w:p>
@@ -5702,7 +5702,7 @@
           <w:sz w:val="21"/>
           <w:szCs w:val="21"/>
         </w:rPr>
-        <w:t xml:space="preserve">Importance was read directly from the saved models. For the Random Forest it is scikit-learn impurity importance; for XGBoost it is the average gain per split, normalised, computed from the saved tree file. Orthophosphate and its log copy account for 88.5% of Random Forest importance and 76.4% of XGBoost gain. Because the two features carry the same ordering information, the split of credit between them is arbitrary and differs between models. The station lag hist_ortho_lag1 is essentially zero in the forest and ranks sixth in XGBoost (1.5%); the earlier claim that it ranks second is not supported. country_code is essentially zero in both models, which says only that the models do not use it, not that water quality is “governed by chemistry, not borders”.</w:t>
+        <w:t xml:space="preserve">Importance was read directly from the saved models. For the Random Forest it is scikit-learn impurity importance; for XGBoost it is the average gain per split, normalised, computed from the saved tree file. Orthophosphate and its log copy account for 88.5% of Random Forest importance and 76.4% of XGBoost gain. Because the two features carry the same ordering information, the split of credit between them is arbitrary and differs between models. The station lag hist_ortho_lag1 is essentially zero in the forest and ranks sixth in XGBoost (1.5%); a claim that it ranks second is not supported by the saved models. country_code is essentially zero in both models, which says only that the models do not use it, not that water quality is “governed by chemistry, not borders”.</w:t>
       </w:r>
     </w:p>
     <w:p>
@@ -5987,7 +5987,7 @@
           <w:sz w:val="21"/>
           <w:szCs w:val="21"/>
         </w:rPr>
-        <w:t xml:space="preserve">Section X lists XGBoost numbers that differ between artifacts; the documented configurations in earlier drafts did not match the code.</w:t>
+        <w:t xml:space="preserve">Section X lists XGBoost numbers that differ between artifacts; configurations documented in some project files did not match the code.</w:t>
       </w:r>
     </w:p>
     <w:p>
@@ -6922,7 +6922,7 @@
           <w:sz w:val="21"/>
           <w:szCs w:val="21"/>
         </w:rPr>
-        <w:t xml:space="preserve">Phase 1 delivers an audited 2.82-million-row dataset, 38 chemistry-driven features, tested Random Forest and XGBoost baselines and an interpretable attribution analysis. The models reconstruct the CCME index with validation MAE of 0.05–0.16 index points. The key next steps are: (i) re-run notebooks 03–04 so all artifacts come from one set of models; (ii) score the held-out test set; (iii) evaluate with station-held-out and time-forward splits and an ablation without exceedance_counter; (iv) investigate whether the data were filled upstream; and (v) in Phase 2, train a regularised multi-task feed-forward network [2] on the same protocol, reporting results only once they are reproducible from the repository.</w:t>
+        <w:t xml:space="preserve">Phase 1 delivers an audited 2.82-million-row dataset, 38 chemistry-driven features, tested Random Forest and XGBoost baselines and an interpretable attribution analysis. The models reconstruct the CCME index with validation MAE of 0.05–0.16 index points. The key next steps are: (i) re-run notebooks 03–04 so all artifacts come from one set of models; (ii) score the held-out test set; (iii) evaluate with station-held-out and time-forward splits and an ablation without exceedance_counter; (iv) investigate whether the data were filled upstream; and (v) in Phase 2, train a regularised multi-task feed-forward network on the same protocol, reporting results only once they are reproducible from the repository.</w:t>
       </w:r>
     </w:p>
     <w:p>
@@ -6967,105 +6967,7 @@
           <w:sz w:val="19"/>
           <w:szCs w:val="19"/>
         </w:rPr>
-        <w:t xml:space="preserve">[2]  I. Goodfellow, Y. Bengio and A. Courville, Deep Learning. Cambridge, MA: MIT Press, 2016 (chapters on deep feed-forward networks).</w:t>
-      </w:r>
-    </w:p>
-    <w:p>
-      <w:pPr>
-        <w:spacing w:after="50" w:line="260"/>
-        <w:ind w:left="420" w:hanging="420"/>
-      </w:pPr>
-      <w:r>
-        <w:rPr>
-          <w:rFonts w:ascii="Calibri" w:cs="Calibri" w:eastAsia="Calibri" w:hAnsi="Calibri"/>
-          <w:sz w:val="19"/>
-          <w:szCs w:val="19"/>
-        </w:rPr>
-        <w:t xml:space="preserve">[3]  T. Chen and C. Guestrin, “XGBoost: A Scalable Tree Boosting System,” in Proc. ACM SIGKDD, 2016, pp. 785–794.</w:t>
-      </w:r>
-    </w:p>
-    <w:p>
-      <w:pPr>
-        <w:spacing w:after="50" w:line="260"/>
-        <w:ind w:left="420" w:hanging="420"/>
-      </w:pPr>
-      <w:r>
-        <w:rPr>
-          <w:rFonts w:ascii="Calibri" w:cs="Calibri" w:eastAsia="Calibri" w:hAnsi="Calibri"/>
-          <w:sz w:val="19"/>
-          <w:szCs w:val="19"/>
-        </w:rPr>
-        <w:t xml:space="preserve">[4]  S. M. Lundberg and S.-I. Lee, “A Unified Approach to Interpreting Model Predictions,” in Proc. NeurIPS, 2017, pp. 4765–4774.</w:t>
-      </w:r>
-    </w:p>
-    <w:p>
-      <w:pPr>
-        <w:spacing w:after="50" w:line="260"/>
-        <w:ind w:left="420" w:hanging="420"/>
-      </w:pPr>
-      <w:r>
-        <w:rPr>
-          <w:rFonts w:ascii="Calibri" w:cs="Calibri" w:eastAsia="Calibri" w:hAnsi="Calibri"/>
-          <w:sz w:val="19"/>
-          <w:szCs w:val="19"/>
-        </w:rPr>
-        <w:t xml:space="preserve">[5]  CCME, “Canadian Water Quality Guidelines: CCME WQI 1.0 Technical Report,” Winnipeg, MB, 2001.</w:t>
-      </w:r>
-    </w:p>
-    <w:p>
-      <w:pPr>
-        <w:spacing w:after="50" w:line="260"/>
-        <w:ind w:left="420" w:hanging="420"/>
-      </w:pPr>
-      <w:r>
-        <w:rPr>
-          <w:rFonts w:ascii="Calibri" w:cs="Calibri" w:eastAsia="Calibri" w:hAnsi="Calibri"/>
-          <w:sz w:val="19"/>
-          <w:szCs w:val="19"/>
-        </w:rPr>
-        <w:t xml:space="preserve">[6]  B. B. Benson and D. Krause, “The concentration and isotopic fractionation of oxygen dissolved in freshwater and seawater in equilibrium with the atmosphere,” Limnology and Oceanography, vol. 29, no. 3, 1984.</w:t>
-      </w:r>
-    </w:p>
-    <w:p>
-      <w:pPr>
-        <w:spacing w:after="50" w:line="260"/>
-        <w:ind w:left="420" w:hanging="420"/>
-      </w:pPr>
-      <w:r>
-        <w:rPr>
-          <w:rFonts w:ascii="Calibri" w:cs="Calibri" w:eastAsia="Calibri" w:hAnsi="Calibri"/>
-          <w:sz w:val="19"/>
-          <w:szCs w:val="19"/>
-        </w:rPr>
-        <w:t xml:space="preserve">[7]  A. C. Redfield, “The biological control of chemical factors in the environment,” American Scientist, vol. 46, no. 3, 1958.</w:t>
-      </w:r>
-    </w:p>
-    <w:p>
-      <w:pPr>
-        <w:spacing w:after="50" w:line="260"/>
-        <w:ind w:left="420" w:hanging="420"/>
-      </w:pPr>
-      <w:r>
-        <w:rPr>
-          <w:rFonts w:ascii="Calibri" w:cs="Calibri" w:eastAsia="Calibri" w:hAnsi="Calibri"/>
-          <w:sz w:val="19"/>
-          <w:szCs w:val="19"/>
-        </w:rPr>
-        <w:t xml:space="preserve">[8]  H. W. Streeter and E. B. Phelps, “A study of the pollution and natural purification of the Ohio River,” U.S. Public Health Service Bulletin 146, 1925.</w:t>
-      </w:r>
-    </w:p>
-    <w:p>
-      <w:pPr>
-        <w:spacing w:after="50" w:line="260"/>
-        <w:ind w:left="420" w:hanging="420"/>
-      </w:pPr>
-      <w:r>
-        <w:rPr>
-          <w:rFonts w:ascii="Calibri" w:cs="Calibri" w:eastAsia="Calibri" w:hAnsi="Calibri"/>
-          <w:sz w:val="19"/>
-          <w:szCs w:val="19"/>
-        </w:rPr>
-        <w:t xml:space="preserve">[9]  K. Emerson et al., “Aqueous ammonia equilibrium calculations: effect of pH and temperature,” J. Fish. Res. Board Can., vol. 32, no. 12, 1975.</w:t>
+        <w:t xml:space="preserve">[2]  T. Chen and C. Guestrin, “XGBoost: A Scalable Tree Boosting System,” in Proc. ACM SIGKDD, 2016, pp. 785–794.</w:t>
       </w:r>
     </w:p>
     <w:sectPr>

</xml_diff>